<commit_message>
Update course site - Oct 13, 2026, 9:26 PM
</commit_message>
<xml_diff>
--- a/content/syllabus/MATH110_Fall2026_Syllabus.docx
+++ b/content/syllabus/MATH110_Fall2026_Syllabus.docx
@@ -2108,34 +2108,7 @@
                 <w:sz w:val="22"/>
                 <w:szCs w:val="22"/>
               </w:rPr>
-              <w:t>HW1 due,</w:t>
-            </w:r>
-            <w:r>
-              <w:rPr>
-                <w:rFonts w:ascii="Arial" w:eastAsia="Arial" w:hAnsi="Arial" w:cs="Arial"/>
-                <w:color w:val="1F3864"/>
-                <w:sz w:val="22"/>
-                <w:szCs w:val="22"/>
-              </w:rPr>
-              <w:t xml:space="preserve"> </w:t>
-            </w:r>
-            <w:r>
-              <w:rPr>
-                <w:rFonts w:ascii="Arial" w:eastAsia="Arial" w:hAnsi="Arial" w:cs="Arial"/>
-                <w:color w:val="1F3864"/>
-                <w:sz w:val="22"/>
-                <w:szCs w:val="22"/>
-              </w:rPr>
-              <w:t>continue</w:t>
-            </w:r>
-            <w:r>
-              <w:rPr>
-                <w:rFonts w:ascii="Arial" w:eastAsia="Arial" w:hAnsi="Arial" w:cs="Arial"/>
-                <w:color w:val="1F3864"/>
-                <w:sz w:val="22"/>
-                <w:szCs w:val="22"/>
-              </w:rPr>
-              <w:t xml:space="preserve"> Counting unit</w:t>
+              <w:t>No class — holiday</w:t>
             </w:r>
           </w:p>
         </w:tc>
@@ -2210,7 +2183,7 @@
                 <w:sz w:val="22"/>
                 <w:szCs w:val="22"/>
               </w:rPr>
-              <w:t>Finish Counting unit</w:t>
+              <w:t>HW1 due, finish Counting unit</w:t>
             </w:r>
           </w:p>
         </w:tc>
@@ -2306,7 +2279,7 @@
                 <w:sz w:val="22"/>
                 <w:szCs w:val="22"/>
               </w:rPr>
-              <w:t>HW1 resubmissions due, HW2 due, begin Probability unit</w:t>
+              <w:t>HW2 due, begin Probability unit</w:t>
             </w:r>
           </w:p>
         </w:tc>
@@ -2381,7 +2354,7 @@
                 <w:sz w:val="22"/>
                 <w:szCs w:val="22"/>
               </w:rPr>
-              <w:t>Continue Probability unit</w:t>
+              <w:t>HW1 resubmissions due, continue Probability unit</w:t>
             </w:r>
           </w:p>
         </w:tc>

</xml_diff>

<commit_message>
Update course site - Oct 20, 2026, 5:45 PM
Fix homework resubmission dates: one week after the graded assignment
is returned. No class on Wed 11/25.

Co-Authored-By: Claude Opus 5.5 <noreply@anthropic.com>
Claude-Session: https://claude.ai/code/session_01RYuwTmj5ksn5ywLwx5Tdir
</commit_message>
<xml_diff>
--- a/content/syllabus/MATH110_Fall2026_Syllabus.docx
+++ b/content/syllabus/MATH110_Fall2026_Syllabus.docx
@@ -1422,6 +1422,14 @@
         </w:rPr>
         <w:t>.</w:t>
       </w:r>
+      <w:r>
+        <w:rPr>
+          <w:rFonts w:ascii="Arial" w:eastAsia="Arial" w:hAnsi="Arial" w:cs="Arial"/>
+          <w:sz w:val="22"/>
+          <w:szCs w:val="22"/>
+        </w:rPr>
+        <w:t xml:space="preserve"> The one exception is Homework 7: since there is no class on Wednesday, November 25, it will be distributed at the end of class on Monday, November 23, and is due at the beginning of class on Monday, November 30.</w:t>
+      </w:r>
     </w:p>
     <w:p>
       <w:pPr>
@@ -1488,31 +1496,28 @@
           <w:sz w:val="22"/>
           <w:szCs w:val="22"/>
         </w:rPr>
-        <w:t xml:space="preserve"> on Monday of the</w:t>
-      </w:r>
-      <w:r>
-        <w:rPr>
-          <w:rFonts w:ascii="Arial" w:eastAsia="Arial" w:hAnsi="Arial" w:cs="Arial"/>
-          <w:sz w:val="22"/>
-          <w:szCs w:val="22"/>
-        </w:rPr>
-        <w:t xml:space="preserve"> week</w:t>
-      </w:r>
-      <w:r>
-        <w:rPr>
-          <w:rFonts w:ascii="Arial" w:eastAsia="Arial" w:hAnsi="Arial" w:cs="Arial"/>
-          <w:sz w:val="22"/>
-          <w:szCs w:val="22"/>
-        </w:rPr>
-        <w:t xml:space="preserve"> following the one</w:t>
-      </w:r>
-      <w:r>
-        <w:rPr>
-          <w:rFonts w:ascii="Arial" w:eastAsia="Arial" w:hAnsi="Arial" w:cs="Arial"/>
-          <w:sz w:val="22"/>
-          <w:szCs w:val="22"/>
-        </w:rPr>
-        <w:t xml:space="preserve"> in which the graded assignment is returned.</w:t>
+        <w:t xml:space="preserve"> one week after the graded assignment is returned, or at the next class meeting if there is no class that day.</w:t>
+      </w:r>
+      <w:r>
+        <w:rPr>
+          <w:rFonts w:ascii="Arial" w:eastAsia="Arial" w:hAnsi="Arial" w:cs="Arial"/>
+          <w:sz w:val="22"/>
+          <w:szCs w:val="22"/>
+        </w:rPr>
+      </w:r>
+      <w:r>
+        <w:rPr>
+          <w:rFonts w:ascii="Arial" w:eastAsia="Arial" w:hAnsi="Arial" w:cs="Arial"/>
+          <w:sz w:val="22"/>
+          <w:szCs w:val="22"/>
+        </w:rPr>
+      </w:r>
+      <w:r>
+        <w:rPr>
+          <w:rFonts w:ascii="Arial" w:eastAsia="Arial" w:hAnsi="Arial" w:cs="Arial"/>
+          <w:sz w:val="22"/>
+          <w:szCs w:val="22"/>
+        </w:rPr>
       </w:r>
       <w:r>
         <w:rPr>
@@ -2354,7 +2359,7 @@
                 <w:sz w:val="22"/>
                 <w:szCs w:val="22"/>
               </w:rPr>
-              <w:t>HW1 resubmissions due, continue Probability unit</w:t>
+              <w:t>Continue Probability unit</w:t>
             </w:r>
           </w:p>
         </w:tc>
@@ -2441,7 +2446,7 @@
                 <w:sz w:val="22"/>
                 <w:szCs w:val="22"/>
               </w:rPr>
-              <w:t>HW2 resubmissions due, HW3 due, continue Probability unit</w:t>
+              <w:t>HW1 resubmissions due, HW3 due, continue Probability unit</w:t>
             </w:r>
           </w:p>
         </w:tc>
@@ -2516,7 +2521,7 @@
                 <w:sz w:val="22"/>
                 <w:szCs w:val="22"/>
               </w:rPr>
-              <w:t>Finish Probability unit</w:t>
+              <w:t>HW2 resubmissions due, finish Probability unit</w:t>
             </w:r>
           </w:p>
         </w:tc>
@@ -2603,34 +2608,31 @@
                 <w:sz w:val="22"/>
                 <w:szCs w:val="22"/>
               </w:rPr>
-              <w:t>HW3 resubmissions due, HW4 due</w:t>
-            </w:r>
-            <w:r>
-              <w:rPr>
-                <w:rFonts w:ascii="Arial" w:eastAsia="Arial" w:hAnsi="Arial" w:cs="Arial"/>
-                <w:color w:val="1F3864"/>
-                <w:sz w:val="22"/>
-                <w:szCs w:val="22"/>
-              </w:rPr>
-              <w:t xml:space="preserve">, </w:t>
-            </w:r>
-            <w:r>
-              <w:rPr>
-                <w:rFonts w:ascii="Arial" w:eastAsia="Arial" w:hAnsi="Arial" w:cs="Arial"/>
-                <w:color w:val="1F3864"/>
-                <w:sz w:val="22"/>
-                <w:szCs w:val="22"/>
-              </w:rPr>
-              <w:t xml:space="preserve">Midterm </w:t>
-            </w:r>
-            <w:r>
-              <w:rPr>
-                <w:rFonts w:ascii="Arial" w:eastAsia="Arial" w:hAnsi="Arial" w:cs="Arial"/>
-                <w:color w:val="1F3864"/>
-                <w:sz w:val="22"/>
-                <w:szCs w:val="22"/>
-              </w:rPr>
-              <w:t>Exam 1 review</w:t>
+              <w:t>HW4 due, Midterm Exam 1 review</w:t>
+            </w:r>
+            <w:r>
+              <w:rPr>
+                <w:rFonts w:ascii="Arial" w:eastAsia="Arial" w:hAnsi="Arial" w:cs="Arial"/>
+                <w:color w:val="1F3864"/>
+                <w:sz w:val="22"/>
+                <w:szCs w:val="22"/>
+              </w:rPr>
+            </w:r>
+            <w:r>
+              <w:rPr>
+                <w:rFonts w:ascii="Arial" w:eastAsia="Arial" w:hAnsi="Arial" w:cs="Arial"/>
+                <w:color w:val="1F3864"/>
+                <w:sz w:val="22"/>
+                <w:szCs w:val="22"/>
+              </w:rPr>
+            </w:r>
+            <w:r>
+              <w:rPr>
+                <w:rFonts w:ascii="Arial" w:eastAsia="Arial" w:hAnsi="Arial" w:cs="Arial"/>
+                <w:color w:val="1F3864"/>
+                <w:sz w:val="22"/>
+                <w:szCs w:val="22"/>
+              </w:rPr>
             </w:r>
           </w:p>
         </w:tc>
@@ -2705,16 +2707,15 @@
                 <w:sz w:val="22"/>
                 <w:szCs w:val="22"/>
               </w:rPr>
-              <w:t>Midterm Exam</w:t>
-            </w:r>
-            <w:r>
-              <w:rPr>
-                <w:rFonts w:ascii="Arial" w:eastAsia="Arial" w:hAnsi="Arial" w:cs="Arial"/>
-                <w:color w:val="1F3864"/>
-                <w:sz w:val="22"/>
-                <w:szCs w:val="22"/>
-              </w:rPr>
-              <w:t xml:space="preserve"> 1</w:t>
+              <w:t>HW3 resubmissions due, Midterm Exam 1</w:t>
+            </w:r>
+            <w:r>
+              <w:rPr>
+                <w:rFonts w:ascii="Arial" w:eastAsia="Arial" w:hAnsi="Arial" w:cs="Arial"/>
+                <w:color w:val="1F3864"/>
+                <w:sz w:val="22"/>
+                <w:szCs w:val="22"/>
+              </w:rPr>
             </w:r>
           </w:p>
         </w:tc>
@@ -2801,7 +2802,7 @@
                 <w:sz w:val="22"/>
                 <w:szCs w:val="22"/>
               </w:rPr>
-              <w:t>HW4 resubmissions due, begin Statistics unit</w:t>
+              <w:t>Begin Statistics unit</w:t>
             </w:r>
           </w:p>
         </w:tc>
@@ -2876,7 +2877,7 @@
                 <w:sz w:val="22"/>
                 <w:szCs w:val="22"/>
               </w:rPr>
-              <w:t>Continue Statistics unit</w:t>
+              <w:t>HW4 resubmissions due, continue Statistics unit</w:t>
             </w:r>
           </w:p>
         </w:tc>
@@ -3125,16 +3126,15 @@
                 <w:sz w:val="22"/>
                 <w:szCs w:val="22"/>
               </w:rPr>
-              <w:t>HW5 resubmissions due, HW6 due, continue</w:t>
-            </w:r>
-            <w:r>
-              <w:rPr>
-                <w:rFonts w:ascii="Arial" w:eastAsia="Arial" w:hAnsi="Arial" w:cs="Arial"/>
-                <w:color w:val="1F3864"/>
-                <w:sz w:val="22"/>
-                <w:szCs w:val="22"/>
-              </w:rPr>
-              <w:t xml:space="preserve"> Statistics unit</w:t>
+              <w:t>HW6 due, finish Statistics unit</w:t>
+            </w:r>
+            <w:r>
+              <w:rPr>
+                <w:rFonts w:ascii="Arial" w:eastAsia="Arial" w:hAnsi="Arial" w:cs="Arial"/>
+                <w:color w:val="1F3864"/>
+                <w:sz w:val="22"/>
+                <w:szCs w:val="22"/>
+              </w:rPr>
             </w:r>
           </w:p>
         </w:tc>
@@ -3218,7 +3218,7 @@
                 <w:sz w:val="22"/>
                 <w:szCs w:val="22"/>
               </w:rPr>
-              <w:t>Finish Statistics unit</w:t>
+              <w:t>No class — holiday</w:t>
             </w:r>
           </w:p>
         </w:tc>
@@ -3306,7 +3306,7 @@
                 <w:sz w:val="22"/>
                 <w:szCs w:val="22"/>
               </w:rPr>
-              <w:t>HW6 resubmissions due, HW7 due, Midterm Exam 2 review</w:t>
+              <w:t>HW5 resubmissions due, HW7 due, Midterm Exam 2 review</w:t>
             </w:r>
           </w:p>
         </w:tc>
@@ -3468,7 +3468,7 @@
                 <w:sz w:val="22"/>
                 <w:szCs w:val="22"/>
               </w:rPr>
-              <w:t>HW7 resubmissions due, Final Exam review</w:t>
+              <w:t>HW6 resubmissions due, Final Exam review</w:t>
             </w:r>
           </w:p>
         </w:tc>
@@ -3543,7 +3543,7 @@
                 <w:sz w:val="22"/>
                 <w:szCs w:val="22"/>
               </w:rPr>
-              <w:t>Final Exam</w:t>
+              <w:t>HW7 resubmissions due, Final Exam</w:t>
             </w:r>
           </w:p>
         </w:tc>

</xml_diff>